<commit_message>
feat: add sello to all generated documents, shrink firma/sello for compromiso etico
- Add ${img_sello} token to 27 templates that were missing it
- Use smaller firma (150x35) and sello (100x93) in compromiso etico
  to keep the document on one page

Co-Authored-By: Claude Opus 4.6 <noreply@anthropic.com>
</commit_message>
<xml_diff>
--- a/resources/form_templates/declaraciones/DECLARACION_JURADA_ART_14_PLANTILLA.docx
+++ b/resources/form_templates/declaraciones/DECLARACION_JURADA_ART_14_PLANTILLA.docx
@@ -391,6 +391,17 @@
       <w:cols w:space="720"/>
       <w:docGrid w:linePitch="360"/>
     </w:sectPr>
+    <w:p>
+      <w:pPr>
+        <w:jc w:val="center"/>
+      </w:pPr>
+      <w:r>
+        <w:rPr>
+          <w:sz w:val="20"/>
+        </w:rPr>
+        <w:t>${img_sello}</w:t>
+      </w:r>
+    </w:p>
   </w:body>
 </w:document>
 </file>

</xml_diff>